<commit_message>
Finalize submission interpretation, reference order and verified document package
</commit_message>
<xml_diff>
--- a/submission/candidate_20260911_review/COVER_LETTER_EndocrineConnections.docx
+++ b/submission/candidate_20260911_review/COVER_LETTER_EndocrineConnections.docx
@@ -2,7 +2,7 @@
 <file path=word/document.xml><?xml version="1.0" encoding="utf-8"?>
 <w:document xmlns:w="http://schemas.openxmlformats.org/wordprocessingml/2006/main" xmlns:m="http://schemas.openxmlformats.org/officeDocument/2006/math" xmlns:r="http://schemas.openxmlformats.org/officeDocument/2006/relationships" xmlns:o="urn:schemas-microsoft-com:office:office" xmlns:v="urn:schemas-microsoft-com:vml" xmlns:w10="urn:schemas-microsoft-com:office:word" xmlns:a="http://schemas.openxmlformats.org/drawingml/2006/main" xmlns:pic="http://schemas.openxmlformats.org/drawingml/2006/picture" xmlns:wp="http://schemas.openxmlformats.org/drawingml/2006/wordprocessingDrawing">
   <w:body>
-    <w:bookmarkStart w:id="20" w:name="cover-letter"/>
+    <w:bookmarkStart w:id="9" w:name="cover-letter"/>
     <w:p>
       <w:pPr>
         <w:pStyle w:val="Title"/>
@@ -19,7 +19,7 @@
         <w:widowControl/>
       </w:pPr>
       <w:r>
-        <w:t xml:space="preserve">11 September 2026</w:t>
+        <w:t xml:space="preserve">12 September 2026</w:t>
       </w:r>
     </w:p>
     <w:p>
@@ -28,15 +28,15 @@
         <w:widowControl/>
       </w:pPr>
       <w:r>
-        <w:t xml:space="preserve">The Editors</w:t>
+        <w:t xml:space="preserve">The Editor-in-Chief</w:t>
       </w:r>
       <w:r>
         <w:br/>
       </w:r>
       <w:r>
         <w:rPr>
+          <w:i/>
           <w:iCs/>
-          <w:i/>
         </w:rPr>
         <w:t xml:space="preserve">Endocrine Connections</w:t>
       </w:r>
@@ -47,7 +47,7 @@
         <w:widowControl/>
       </w:pPr>
       <w:r>
-        <w:t xml:space="preserve">Dear Editors,</w:t>
+        <w:t xml:space="preserve">Dear Editor-in-Chief,</w:t>
       </w:r>
     </w:p>
     <w:p>
@@ -56,25 +56,7 @@
         <w:widowControl/>
       </w:pPr>
       <w:r>
-        <w:t xml:space="preserve">Please consider</w:t>
-      </w:r>
-      <w:r>
-        <w:t xml:space="preserve"> </w:t>
-      </w:r>
-      <w:r>
-        <w:t xml:space="preserve">“</w:t>
-      </w:r>
-      <w:r>
-        <w:t xml:space="preserve">Genetic evidence for TSHR and IGF1R in Graves disease and thyroid eye disease</w:t>
-      </w:r>
-      <w:r>
-        <w:t xml:space="preserve">”</w:t>
-      </w:r>
-      <w:r>
-        <w:t xml:space="preserve"> </w:t>
-      </w:r>
-      <w:r>
-        <w:t xml:space="preserve">as an original research article.</w:t>
+        <w:t xml:space="preserve">Please consider “Genetic evidence for TSHR and IGF1R in Graves disease and thyroid eye disease” as an original research article.</w:t>
       </w:r>
     </w:p>
     <w:p>
@@ -108,8 +90,8 @@
       </w:r>
       <w:r>
         <w:rPr>
+          <w:i/>
           <w:iCs/>
-          <w:i/>
         </w:rPr>
         <w:t xml:space="preserve">P</w:t>
       </w:r>
@@ -182,11 +164,23 @@
         <w:t xml:space="preserve">E-mail: yswoph@catholic.ac.kr</w:t>
       </w:r>
     </w:p>
-    <w:bookmarkEnd w:id="20"/>
+    <w:p>
+      <w:pPr>
+        <w:pStyle w:val="BodyText"/>
+        <w:widowControl/>
+      </w:pPr>
+      <w:r>
+        <w:t xml:space="preserve">Author institutions: Jungyul Park and Suk-Woo Yang — Department of Ophthalmology, Seoul St. Mary’s Hospital, College of Medicine, The Catholic University of Korea, Seoul; Min-Seon Kim — Department of Ophthalmology, College of Medicine, The Catholic University of Korea, Seoul; Kyung-Hwa Shin — Department of Laboratory Medicine, Pusan National University Hospital, Busan. All institutions are in the Republic of Korea.</w:t>
+      </w:r>
+    </w:p>
+    <w:bookmarkEnd w:id="9"/>
     <w:sectPr>
       <w:footerReference w:type="default" r:id="rId9"/>
       <w:footerReference w:type="first" r:id="rId10"/>
       <w:footerReference w:type="even" r:id="rId11"/>
+      <w:footnotePr>
+        <w:numRestart w:val="eachSect"/>
+      </w:footnotePr>
       <w:pgSz w:w="11909" w:h="16834"/>
       <w:pgMar w:left="1368" w:right="1368" w:top="1152" w:bottom="1152" w:header="432" w:footer="432"/>
     </w:sectPr>
@@ -280,14 +274,14 @@
 <file path=word/numbering.xml><?xml version="1.0" encoding="utf-8"?>
 <w:numbering xmlns:w="http://schemas.openxmlformats.org/wordprocessingml/2006/main">
   <w:abstractNum w:abstractNumId="990">
-    <w:nsid w:val="A990"/>
+    <w:nsid w:val="0000A990"/>
     <w:multiLevelType w:val="multilevel"/>
     <w:lvl w:ilvl="0">
       <w:numFmt w:val="bullet"/>
       <w:lvlText w:val=" "/>
       <w:lvlJc w:val="left"/>
       <w:pPr>
-        <w:ind w:left="720" w:hanging="480"/>
+        <w:ind w:left="720" w:hanging="360"/>
       </w:pPr>
     </w:lvl>
     <w:lvl w:ilvl="1">
@@ -295,7 +289,7 @@
       <w:lvlText w:val=" "/>
       <w:lvlJc w:val="left"/>
       <w:pPr>
-        <w:ind w:left="1440" w:hanging="480"/>
+        <w:ind w:left="1440" w:hanging="360"/>
       </w:pPr>
     </w:lvl>
     <w:lvl w:ilvl="2">
@@ -303,7 +297,7 @@
       <w:lvlText w:val=" "/>
       <w:lvlJc w:val="left"/>
       <w:pPr>
-        <w:ind w:left="2160" w:hanging="480"/>
+        <w:ind w:left="2160" w:hanging="360"/>
       </w:pPr>
     </w:lvl>
     <w:lvl w:ilvl="3">
@@ -311,7 +305,7 @@
       <w:lvlText w:val=" "/>
       <w:lvlJc w:val="left"/>
       <w:pPr>
-        <w:ind w:left="2880" w:hanging="480"/>
+        <w:ind w:left="2880" w:hanging="360"/>
       </w:pPr>
     </w:lvl>
     <w:lvl w:ilvl="4">
@@ -319,7 +313,7 @@
       <w:lvlText w:val=" "/>
       <w:lvlJc w:val="left"/>
       <w:pPr>
-        <w:ind w:left="3600" w:hanging="480"/>
+        <w:ind w:left="3600" w:hanging="360"/>
       </w:pPr>
     </w:lvl>
     <w:lvl w:ilvl="5">
@@ -327,7 +321,7 @@
       <w:lvlText w:val=" "/>
       <w:lvlJc w:val="left"/>
       <w:pPr>
-        <w:ind w:left="4320" w:hanging="480"/>
+        <w:ind w:left="4320" w:hanging="360"/>
       </w:pPr>
     </w:lvl>
     <w:lvl w:ilvl="6">
@@ -335,7 +329,7 @@
       <w:lvlText w:val=" "/>
       <w:lvlJc w:val="left"/>
       <w:pPr>
-        <w:ind w:left="5040" w:hanging="480"/>
+        <w:ind w:left="5040" w:hanging="360"/>
       </w:pPr>
     </w:lvl>
     <w:lvl w:ilvl="7">
@@ -343,7 +337,7 @@
       <w:lvlText w:val=" "/>
       <w:lvlJc w:val="left"/>
       <w:pPr>
-        <w:ind w:left="5760" w:hanging="480"/>
+        <w:ind w:left="5760" w:hanging="360"/>
       </w:pPr>
     </w:lvl>
     <w:lvl w:ilvl="8">
@@ -351,7 +345,7 @@
       <w:lvlText w:val=" "/>
       <w:lvlJc w:val="left"/>
       <w:pPr>
-        <w:ind w:left="6480" w:hanging="480"/>
+        <w:ind w:left="6480" w:hanging="360"/>
       </w:pPr>
     </w:lvl>
   </w:abstractNum>
@@ -366,10 +360,10 @@
   <w:docDefaults>
     <w:rPrDefault>
       <w:rPr>
-        <w:rFonts w:asciiTheme="minorHAnsi" w:cstheme="minorBidi" w:eastAsiaTheme="minorHAnsi" w:hAnsiTheme="minorHAnsi"/>
+        <w:rFonts w:asciiTheme="minorHAnsi" w:cstheme="minorBidi" w:eastAsiaTheme="minorEastAsia" w:hAnsiTheme="minorHAnsi"/>
         <w:sz w:val="24"/>
         <w:szCs w:val="24"/>
-        <w:lang w:bidi="ar-SA" w:eastAsia="en-US" w:val="en-US"/>
+        <w:lang w:bidi="ar-SA" w:eastAsia="zh-CN" w:val="en-US"/>
       </w:rPr>
     </w:rPrDefault>
     <w:pPrDefault>
@@ -394,10 +388,10 @@
     <w:name w:val="Body Text"/>
     <w:basedOn w:val="Normal"/>
     <w:link w:val="BodyTextChar"/>
+    <w:qFormat/>
     <w:pPr>
       <w:spacing w:after="100" w:before="180" w:line="240" w:lineRule="auto"/>
     </w:pPr>
-    <w:qFormat/>
     <w:rPr>
       <w:rFonts w:ascii="Times New Roman" w:hAnsi="Times New Roman"/>
       <w:sz w:val="22"/>
@@ -432,57 +426,97 @@
     <w:name w:val="Title"/>
     <w:basedOn w:val="Normal"/>
     <w:next w:val="BodyText"/>
-    <w:qFormat/>
-    <w:pPr>
-      <w:keepNext/>
-      <w:keepLines/>
-      <w:spacing w:after="120" w:before="240" w:line="276" w:lineRule="auto"/>
+    <w:link w:val="TitleChar"/>
+    <w:uiPriority w:val="10"/>
+    <w:qFormat/>
+    <w:rsid w:val="00A10FD9"/>
+    <w:pPr>
+      <w:keepNext/>
+      <w:spacing w:after="120" w:line="276" w:lineRule="auto" w:before="240"/>
+      <w:contextualSpacing/>
       <w:jc w:val="center"/>
     </w:pPr>
     <w:rPr>
       <w:rFonts w:asciiTheme="majorHAnsi" w:cstheme="majorBidi" w:eastAsiaTheme="majorEastAsia" w:hAnsiTheme="majorHAnsi" w:ascii="Times New Roman" w:hAnsi="Times New Roman"/>
       <w:b/>
-      <w:bCs/>
       <w:color w:val="000000"/>
       <w:sz w:val="30"/>
-      <w:szCs w:val="36"/>
+      <w:szCs w:val="56"/>
+    </w:rPr>
+  </w:style>
+  <w:style w:customStyle="1" w:styleId="TitleChar" w:type="character">
+    <w:name w:val="Title Char"/>
+    <w:basedOn w:val="DefaultParagraphFont"/>
+    <w:link w:val="Title"/>
+    <w:uiPriority w:val="10"/>
+    <w:rsid w:val="00A10FD9"/>
+    <w:rPr>
+      <w:rFonts w:asciiTheme="majorHAnsi" w:cstheme="majorBidi" w:eastAsiaTheme="majorEastAsia" w:hAnsiTheme="majorHAnsi"/>
+      <w:sz w:val="56"/>
+      <w:szCs w:val="56"/>
     </w:rPr>
   </w:style>
   <w:style w:styleId="Subtitle" w:type="paragraph">
     <w:name w:val="Subtitle"/>
     <w:basedOn w:val="Title"/>
     <w:next w:val="BodyText"/>
-    <w:qFormat/>
-    <w:pPr>
-      <w:keepNext/>
-      <w:keepLines/>
-      <w:spacing w:after="240" w:before="240"/>
-      <w:jc w:val="center"/>
-    </w:pPr>
-    <w:rPr>
-      <w:sz w:val="30"/>
-      <w:szCs w:val="30"/>
+    <w:link w:val="SubtitleChar"/>
+    <w:uiPriority w:val="11"/>
+    <w:qFormat/>
+    <w:rsid w:val="00A10FD9"/>
+    <w:pPr>
+      <w:numPr>
+        <w:ilvl w:val="1"/>
+      </w:numPr>
+    </w:pPr>
+    <w:rPr>
+      <w:rFonts w:cstheme="majorBidi" w:eastAsiaTheme="majorEastAsia"/>
+      <w:spacing w:val="15"/>
+      <w:sz w:val="28"/>
+      <w:szCs w:val="28"/>
+    </w:rPr>
+  </w:style>
+  <w:style w:customStyle="1" w:styleId="SubtitleChar" w:type="character">
+    <w:name w:val="Subtitle Char"/>
+    <w:basedOn w:val="DefaultParagraphFont"/>
+    <w:link w:val="Subtitle"/>
+    <w:uiPriority w:val="11"/>
+    <w:rsid w:val="00A10FD9"/>
+    <w:rPr>
+      <w:rFonts w:cstheme="majorBidi" w:eastAsiaTheme="majorEastAsia"/>
+      <w:color w:themeColor="text1" w:themeTint="A6" w:val="595959"/>
+      <w:spacing w:val="15"/>
+      <w:sz w:val="28"/>
+      <w:szCs w:val="28"/>
     </w:rPr>
   </w:style>
   <w:style w:customStyle="1" w:styleId="Author" w:type="paragraph">
     <w:name w:val="Author"/>
+    <w:basedOn w:val="Title"/>
     <w:next w:val="BodyText"/>
     <w:qFormat/>
     <w:pPr>
       <w:keepNext/>
       <w:keepLines/>
-      <w:jc w:val="center"/>
-    </w:pPr>
+    </w:pPr>
+    <w:rPr>
+      <w:sz w:val="24"/>
+      <w:szCs w:val="24"/>
+    </w:rPr>
   </w:style>
   <w:style w:styleId="Date" w:type="paragraph">
     <w:name w:val="Date"/>
+    <w:basedOn w:val="Title"/>
     <w:next w:val="BodyText"/>
     <w:qFormat/>
     <w:pPr>
       <w:keepNext/>
       <w:keepLines/>
-      <w:jc w:val="center"/>
-    </w:pPr>
+    </w:pPr>
+    <w:rPr>
+      <w:sz w:val="24"/>
+      <w:szCs w:val="24"/>
+    </w:rPr>
   </w:style>
   <w:style w:customStyle="1" w:styleId="AbstractTitle" w:type="paragraph">
     <w:name w:val="Abstract Title"/>
@@ -492,15 +526,13 @@
     <w:pPr>
       <w:keepNext/>
       <w:keepLines/>
+      <w:spacing w:after="0" w:before="300"/>
       <w:jc w:val="center"/>
-      <w:spacing w:after="0" w:before="300"/>
-    </w:pPr>
-    <w:rPr>
+    </w:pPr>
+    <w:rPr>
+      <w:b/>
       <w:sz w:val="20"/>
       <w:szCs w:val="20"/>
-      <w:b/>
-      <w:color w:val="345A8A"/>
-      &gt;
     </w:rPr>
   </w:style>
   <w:style w:customStyle="1" w:styleId="Abstract" w:type="paragraph">
@@ -527,191 +559,326 @@
     <w:rPr/>
   </w:style>
   <w:style w:styleId="Heading1" w:type="paragraph">
-    <w:name w:val="Heading 1"/>
-    <w:basedOn w:val="Normal"/>
-    <w:next w:val="BodyText"/>
-    <w:uiPriority w:val="9"/>
-    <w:qFormat/>
+    <w:name w:val="heading 1"/>
+    <w:basedOn w:val="Normal"/>
+    <w:next w:val="BodyText"/>
+    <w:link w:val="Heading1Char"/>
+    <w:uiPriority w:val="9"/>
+    <w:qFormat/>
+    <w:rsid w:val="00A10FD9"/>
     <w:pPr>
       <w:keepNext/>
       <w:keepLines/>
-      <w:spacing w:after="0" w:before="480"/>
+      <w:spacing w:after="120" w:before="240" w:line="276" w:lineRule="auto"/>
       <w:outlineLvl w:val="0"/>
     </w:pPr>
     <w:rPr>
+      <w:rFonts w:asciiTheme="majorHAnsi" w:cstheme="majorBidi" w:eastAsiaTheme="majorEastAsia" w:hAnsiTheme="majorHAnsi" w:ascii="Times New Roman" w:hAnsi="Times New Roman"/>
+      <w:b/>
+      <w:color w:val="000000"/>
+      <w:sz w:val="24"/>
+      <w:szCs w:val="40"/>
+    </w:rPr>
+  </w:style>
+  <w:style w:styleId="Heading2" w:type="paragraph">
+    <w:name w:val="heading 2"/>
+    <w:basedOn w:val="Normal"/>
+    <w:next w:val="BodyText"/>
+    <w:link w:val="Heading2Char"/>
+    <w:uiPriority w:val="9"/>
+    <w:semiHidden/>
+    <w:unhideWhenUsed/>
+    <w:qFormat/>
+    <w:rsid w:val="00A10FD9"/>
+    <w:pPr>
+      <w:keepNext/>
+      <w:keepLines/>
+      <w:spacing w:after="120" w:before="240" w:line="276" w:lineRule="auto"/>
+      <w:outlineLvl w:val="1"/>
+    </w:pPr>
+    <w:rPr>
+      <w:rFonts w:asciiTheme="majorHAnsi" w:cstheme="majorBidi" w:eastAsiaTheme="majorEastAsia" w:hAnsiTheme="majorHAnsi" w:ascii="Times New Roman" w:hAnsi="Times New Roman"/>
+      <w:b/>
+      <w:color w:val="000000"/>
+      <w:sz w:val="24"/>
+      <w:szCs w:val="32"/>
+    </w:rPr>
+  </w:style>
+  <w:style w:styleId="Heading3" w:type="paragraph">
+    <w:name w:val="heading 3"/>
+    <w:basedOn w:val="Normal"/>
+    <w:next w:val="BodyText"/>
+    <w:link w:val="Heading3Char"/>
+    <w:uiPriority w:val="9"/>
+    <w:semiHidden/>
+    <w:unhideWhenUsed/>
+    <w:qFormat/>
+    <w:rsid w:val="00A10FD9"/>
+    <w:pPr>
+      <w:keepNext/>
+      <w:keepLines/>
+      <w:spacing w:after="120" w:before="240" w:line="276" w:lineRule="auto"/>
+      <w:outlineLvl w:val="2"/>
+    </w:pPr>
+    <w:rPr>
+      <w:rFonts w:cstheme="majorBidi" w:eastAsiaTheme="majorEastAsia" w:ascii="Times New Roman" w:hAnsi="Times New Roman"/>
+      <w:b/>
+      <w:color w:val="000000"/>
+      <w:sz w:val="24"/>
+      <w:szCs w:val="28"/>
+    </w:rPr>
+  </w:style>
+  <w:style w:styleId="Heading4" w:type="paragraph">
+    <w:name w:val="heading 4"/>
+    <w:basedOn w:val="Normal"/>
+    <w:next w:val="BodyText"/>
+    <w:link w:val="Heading4Char"/>
+    <w:uiPriority w:val="9"/>
+    <w:semiHidden/>
+    <w:unhideWhenUsed/>
+    <w:qFormat/>
+    <w:rsid w:val="00A10FD9"/>
+    <w:pPr>
+      <w:keepNext/>
+      <w:keepLines/>
+      <w:spacing w:after="120" w:before="240" w:line="276" w:lineRule="auto"/>
+      <w:outlineLvl w:val="3"/>
+    </w:pPr>
+    <w:rPr>
+      <w:rFonts w:cstheme="majorBidi" w:eastAsiaTheme="majorEastAsia" w:ascii="Times New Roman" w:hAnsi="Times New Roman"/>
+      <w:b/>
+      <w:i/>
+      <w:iCs/>
+      <w:color w:val="000000"/>
+      <w:sz w:val="24"/>
+    </w:rPr>
+  </w:style>
+  <w:style w:styleId="Heading5" w:type="paragraph">
+    <w:name w:val="heading 5"/>
+    <w:basedOn w:val="Normal"/>
+    <w:next w:val="BodyText"/>
+    <w:link w:val="Heading5Char"/>
+    <w:uiPriority w:val="9"/>
+    <w:semiHidden/>
+    <w:unhideWhenUsed/>
+    <w:qFormat/>
+    <w:rsid w:val="00A10FD9"/>
+    <w:pPr>
+      <w:keepNext/>
+      <w:keepLines/>
+      <w:spacing w:after="40" w:before="80"/>
+      <w:outlineLvl w:val="4"/>
+    </w:pPr>
+    <w:rPr>
+      <w:rFonts w:cstheme="majorBidi" w:eastAsiaTheme="majorEastAsia"/>
+      <w:color w:themeColor="accent1" w:themeShade="BF" w:val="0F4761"/>
+    </w:rPr>
+  </w:style>
+  <w:style w:styleId="Heading6" w:type="paragraph">
+    <w:name w:val="heading 6"/>
+    <w:basedOn w:val="Normal"/>
+    <w:next w:val="BodyText"/>
+    <w:link w:val="Heading6Char"/>
+    <w:uiPriority w:val="9"/>
+    <w:semiHidden/>
+    <w:unhideWhenUsed/>
+    <w:qFormat/>
+    <w:rsid w:val="00A10FD9"/>
+    <w:pPr>
+      <w:keepNext/>
+      <w:keepLines/>
+      <w:spacing w:after="0" w:before="40"/>
+      <w:outlineLvl w:val="5"/>
+    </w:pPr>
+    <w:rPr>
+      <w:rFonts w:cstheme="majorBidi" w:eastAsiaTheme="majorEastAsia"/>
+      <w:i/>
+      <w:iCs/>
+      <w:color w:themeColor="text1" w:themeTint="A6" w:val="595959"/>
+    </w:rPr>
+  </w:style>
+  <w:style w:styleId="Heading7" w:type="paragraph">
+    <w:name w:val="heading 7"/>
+    <w:basedOn w:val="Normal"/>
+    <w:next w:val="BodyText"/>
+    <w:link w:val="Heading7Char"/>
+    <w:uiPriority w:val="9"/>
+    <w:semiHidden/>
+    <w:unhideWhenUsed/>
+    <w:qFormat/>
+    <w:rsid w:val="00A10FD9"/>
+    <w:pPr>
+      <w:keepNext/>
+      <w:keepLines/>
+      <w:spacing w:after="0" w:before="40"/>
+      <w:outlineLvl w:val="6"/>
+    </w:pPr>
+    <w:rPr>
+      <w:rFonts w:cstheme="majorBidi" w:eastAsiaTheme="majorEastAsia"/>
+      <w:color w:themeColor="text1" w:themeTint="A6" w:val="595959"/>
+    </w:rPr>
+  </w:style>
+  <w:style w:styleId="Heading8" w:type="paragraph">
+    <w:name w:val="heading 8"/>
+    <w:basedOn w:val="Normal"/>
+    <w:next w:val="BodyText"/>
+    <w:link w:val="Heading8Char"/>
+    <w:uiPriority w:val="9"/>
+    <w:semiHidden/>
+    <w:unhideWhenUsed/>
+    <w:qFormat/>
+    <w:rsid w:val="00A10FD9"/>
+    <w:pPr>
+      <w:keepNext/>
+      <w:keepLines/>
+      <w:spacing w:after="0"/>
+      <w:outlineLvl w:val="7"/>
+    </w:pPr>
+    <w:rPr>
+      <w:rFonts w:cstheme="majorBidi" w:eastAsiaTheme="majorEastAsia"/>
+      <w:i/>
+      <w:iCs/>
+      <w:color w:themeColor="text1" w:themeTint="D8" w:val="272727"/>
+    </w:rPr>
+  </w:style>
+  <w:style w:styleId="Heading9" w:type="paragraph">
+    <w:name w:val="heading 9"/>
+    <w:basedOn w:val="Normal"/>
+    <w:next w:val="BodyText"/>
+    <w:link w:val="Heading9Char"/>
+    <w:uiPriority w:val="9"/>
+    <w:semiHidden/>
+    <w:unhideWhenUsed/>
+    <w:qFormat/>
+    <w:rsid w:val="00A10FD9"/>
+    <w:pPr>
+      <w:keepNext/>
+      <w:keepLines/>
+      <w:spacing w:after="0"/>
+      <w:outlineLvl w:val="8"/>
+    </w:pPr>
+    <w:rPr>
+      <w:rFonts w:cstheme="majorBidi" w:eastAsiaTheme="majorEastAsia"/>
+      <w:color w:themeColor="text1" w:themeTint="D8" w:val="272727"/>
+    </w:rPr>
+  </w:style>
+  <w:style w:customStyle="1" w:styleId="Heading1Char" w:type="character">
+    <w:name w:val="Heading 1 Char"/>
+    <w:basedOn w:val="DefaultParagraphFont"/>
+    <w:link w:val="Heading1"/>
+    <w:uiPriority w:val="9"/>
+    <w:rsid w:val="00A10FD9"/>
+    <w:rPr>
       <w:rFonts w:asciiTheme="majorHAnsi" w:cstheme="majorBidi" w:eastAsiaTheme="majorEastAsia" w:hAnsiTheme="majorHAnsi"/>
-      <w:b/>
-      <w:bCs/>
-      <w:color w:themeColor="accent1" w:val="4F81BD"/>
+      <w:color w:themeColor="accent1" w:themeShade="BF" w:val="0F4761"/>
+      <w:sz w:val="40"/>
+      <w:szCs w:val="40"/>
+    </w:rPr>
+  </w:style>
+  <w:style w:customStyle="1" w:styleId="Heading2Char" w:type="character">
+    <w:name w:val="Heading 2 Char"/>
+    <w:basedOn w:val="DefaultParagraphFont"/>
+    <w:link w:val="Heading2"/>
+    <w:uiPriority w:val="9"/>
+    <w:semiHidden/>
+    <w:rsid w:val="00A10FD9"/>
+    <w:rPr>
+      <w:rFonts w:asciiTheme="majorHAnsi" w:cstheme="majorBidi" w:eastAsiaTheme="majorEastAsia" w:hAnsiTheme="majorHAnsi"/>
+      <w:color w:themeColor="accent1" w:themeShade="BF" w:val="0F4761"/>
       <w:sz w:val="32"/>
       <w:szCs w:val="32"/>
     </w:rPr>
   </w:style>
-  <w:style w:styleId="Heading2" w:type="paragraph">
-    <w:name w:val="Heading 2"/>
-    <w:basedOn w:val="Normal"/>
-    <w:next w:val="BodyText"/>
-    <w:uiPriority w:val="9"/>
-    <w:unhideWhenUsed/>
-    <w:qFormat/>
-    <w:pPr>
-      <w:keepNext/>
-      <w:keepLines/>
-      <w:spacing w:after="0" w:before="200"/>
-      <w:outlineLvl w:val="1"/>
-    </w:pPr>
-    <w:rPr>
-      <w:rFonts w:asciiTheme="majorHAnsi" w:cstheme="majorBidi" w:eastAsiaTheme="majorEastAsia" w:hAnsiTheme="majorHAnsi"/>
-      <w:b/>
-      <w:bCs/>
-      <w:color w:themeColor="accent1" w:val="4F81BD"/>
+  <w:style w:customStyle="1" w:styleId="Heading3Char" w:type="character">
+    <w:name w:val="Heading 3 Char"/>
+    <w:basedOn w:val="DefaultParagraphFont"/>
+    <w:link w:val="Heading3"/>
+    <w:uiPriority w:val="9"/>
+    <w:semiHidden/>
+    <w:rsid w:val="00A10FD9"/>
+    <w:rPr>
+      <w:rFonts w:cstheme="majorBidi" w:eastAsiaTheme="majorEastAsia"/>
+      <w:color w:themeColor="accent1" w:themeShade="BF" w:val="0F4761"/>
       <w:sz w:val="28"/>
       <w:szCs w:val="28"/>
     </w:rPr>
   </w:style>
-  <w:style w:styleId="Heading3" w:type="paragraph">
-    <w:name w:val="Heading 3"/>
-    <w:basedOn w:val="Normal"/>
-    <w:next w:val="BodyText"/>
-    <w:uiPriority w:val="9"/>
-    <w:unhideWhenUsed/>
-    <w:qFormat/>
-    <w:pPr>
-      <w:keepNext/>
-      <w:keepLines/>
-      <w:spacing w:after="0" w:before="200"/>
-      <w:outlineLvl w:val="2"/>
-    </w:pPr>
-    <w:rPr>
-      <w:rFonts w:asciiTheme="majorHAnsi" w:cstheme="majorBidi" w:eastAsiaTheme="majorEastAsia" w:hAnsiTheme="majorHAnsi"/>
-      <w:b/>
-      <w:bCs/>
-      <w:color w:themeColor="accent1" w:val="4F81BD"/>
-      <w:sz w:val="24"/>
-      <w:szCs w:val="24"/>
-    </w:rPr>
-  </w:style>
-  <w:style w:styleId="Heading4" w:type="paragraph">
-    <w:name w:val="Heading 4"/>
-    <w:basedOn w:val="Normal"/>
-    <w:next w:val="BodyText"/>
-    <w:uiPriority w:val="9"/>
-    <w:unhideWhenUsed/>
-    <w:qFormat/>
-    <w:pPr>
-      <w:keepNext/>
-      <w:keepLines/>
-      <w:spacing w:after="0" w:before="200"/>
-      <w:outlineLvl w:val="3"/>
-    </w:pPr>
-    <w:rPr>
-      <w:rFonts w:asciiTheme="majorHAnsi" w:cstheme="majorBidi" w:eastAsiaTheme="majorEastAsia" w:hAnsiTheme="majorHAnsi"/>
+  <w:style w:customStyle="1" w:styleId="Heading4Char" w:type="character">
+    <w:name w:val="Heading 4 Char"/>
+    <w:basedOn w:val="DefaultParagraphFont"/>
+    <w:link w:val="Heading4"/>
+    <w:uiPriority w:val="9"/>
+    <w:semiHidden/>
+    <w:rsid w:val="00A10FD9"/>
+    <w:rPr>
+      <w:rFonts w:cstheme="majorBidi" w:eastAsiaTheme="majorEastAsia"/>
       <w:i/>
-      <w:bCs/>
-      <w:color w:themeColor="accent1" w:val="4F81BD"/>
-      <w:sz w:val="24"/>
-      <w:szCs w:val="24"/>
-    </w:rPr>
-  </w:style>
-  <w:style w:styleId="Heading5" w:type="paragraph">
-    <w:name w:val="Heading 5"/>
-    <w:basedOn w:val="Normal"/>
-    <w:next w:val="BodyText"/>
-    <w:uiPriority w:val="9"/>
-    <w:unhideWhenUsed/>
-    <w:qFormat/>
-    <w:pPr>
-      <w:keepNext/>
-      <w:keepLines/>
-      <w:spacing w:after="0" w:before="200"/>
-      <w:outlineLvl w:val="4"/>
-    </w:pPr>
-    <w:rPr>
-      <w:rFonts w:asciiTheme="majorHAnsi" w:cstheme="majorBidi" w:eastAsiaTheme="majorEastAsia" w:hAnsiTheme="majorHAnsi"/>
       <w:iCs/>
-      <w:color w:themeColor="accent1" w:val="4F81BD"/>
-      <w:sz w:val="24"/>
-      <w:szCs w:val="24"/>
-    </w:rPr>
-  </w:style>
-  <w:style w:styleId="Heading6" w:type="paragraph">
-    <w:name w:val="Heading 6"/>
-    <w:basedOn w:val="Normal"/>
-    <w:next w:val="BodyText"/>
-    <w:uiPriority w:val="9"/>
-    <w:unhideWhenUsed/>
-    <w:qFormat/>
-    <w:pPr>
-      <w:keepNext/>
-      <w:keepLines/>
-      <w:spacing w:after="0" w:before="200"/>
-      <w:outlineLvl w:val="5"/>
-    </w:pPr>
-    <w:rPr>
-      <w:rFonts w:asciiTheme="majorHAnsi" w:cstheme="majorBidi" w:eastAsiaTheme="majorEastAsia" w:hAnsiTheme="majorHAnsi"/>
-      <w:color w:themeColor="accent1" w:val="4F81BD"/>
-      <w:sz w:val="24"/>
-      <w:szCs w:val="24"/>
-    </w:rPr>
-  </w:style>
-  <w:style w:styleId="Heading7" w:type="paragraph">
-    <w:name w:val="Heading 7"/>
-    <w:basedOn w:val="Normal"/>
-    <w:next w:val="BodyText"/>
-    <w:uiPriority w:val="9"/>
-    <w:unhideWhenUsed/>
-    <w:qFormat/>
-    <w:pPr>
-      <w:keepNext/>
-      <w:keepLines/>
-      <w:spacing w:after="0" w:before="200"/>
-      <w:outlineLvl w:val="6"/>
-    </w:pPr>
-    <w:rPr>
-      <w:rFonts w:asciiTheme="majorHAnsi" w:cstheme="majorBidi" w:eastAsiaTheme="majorEastAsia" w:hAnsiTheme="majorHAnsi"/>
-      <w:color w:themeColor="accent1" w:val="4F81BD"/>
-      <w:sz w:val="24"/>
-      <w:szCs w:val="24"/>
-    </w:rPr>
-  </w:style>
-  <w:style w:styleId="Heading8" w:type="paragraph">
-    <w:name w:val="Heading 8"/>
-    <w:basedOn w:val="Normal"/>
-    <w:next w:val="BodyText"/>
-    <w:uiPriority w:val="9"/>
-    <w:unhideWhenUsed/>
-    <w:qFormat/>
-    <w:pPr>
-      <w:keepNext/>
-      <w:keepLines/>
-      <w:spacing w:after="0" w:before="200"/>
-      <w:outlineLvl w:val="7"/>
-    </w:pPr>
-    <w:rPr>
-      <w:rFonts w:asciiTheme="majorHAnsi" w:cstheme="majorBidi" w:eastAsiaTheme="majorEastAsia" w:hAnsiTheme="majorHAnsi"/>
-      <w:color w:themeColor="accent1" w:val="4F81BD"/>
-      <w:sz w:val="24"/>
-      <w:szCs w:val="24"/>
-    </w:rPr>
-  </w:style>
-  <w:style w:styleId="Heading9" w:type="paragraph">
-    <w:name w:val="Heading 9"/>
-    <w:basedOn w:val="Normal"/>
-    <w:next w:val="BodyText"/>
-    <w:uiPriority w:val="9"/>
-    <w:unhideWhenUsed/>
-    <w:qFormat/>
-    <w:pPr>
-      <w:keepNext/>
-      <w:keepLines/>
-      <w:spacing w:after="0" w:before="200"/>
-      <w:outlineLvl w:val="8"/>
-    </w:pPr>
-    <w:rPr>
-      <w:rFonts w:asciiTheme="majorHAnsi" w:cstheme="majorBidi" w:eastAsiaTheme="majorEastAsia" w:hAnsiTheme="majorHAnsi"/>
-      <w:color w:themeColor="accent1" w:val="4F81BD"/>
-      <w:sz w:val="24"/>
-      <w:szCs w:val="24"/>
+      <w:color w:themeColor="accent1" w:themeShade="BF" w:val="0F4761"/>
+    </w:rPr>
+  </w:style>
+  <w:style w:customStyle="1" w:styleId="Heading5Char" w:type="character">
+    <w:name w:val="Heading 5 Char"/>
+    <w:basedOn w:val="DefaultParagraphFont"/>
+    <w:link w:val="Heading5"/>
+    <w:uiPriority w:val="9"/>
+    <w:semiHidden/>
+    <w:rsid w:val="00A10FD9"/>
+    <w:rPr>
+      <w:rFonts w:cstheme="majorBidi" w:eastAsiaTheme="majorEastAsia"/>
+      <w:color w:themeColor="accent1" w:themeShade="BF" w:val="0F4761"/>
+    </w:rPr>
+  </w:style>
+  <w:style w:customStyle="1" w:styleId="Heading6Char" w:type="character">
+    <w:name w:val="Heading 6 Char"/>
+    <w:basedOn w:val="DefaultParagraphFont"/>
+    <w:link w:val="Heading6"/>
+    <w:uiPriority w:val="9"/>
+    <w:semiHidden/>
+    <w:rsid w:val="00A10FD9"/>
+    <w:rPr>
+      <w:rFonts w:cstheme="majorBidi" w:eastAsiaTheme="majorEastAsia"/>
+      <w:i/>
+      <w:iCs/>
+      <w:color w:themeColor="text1" w:themeTint="A6" w:val="595959"/>
+    </w:rPr>
+  </w:style>
+  <w:style w:customStyle="1" w:styleId="Heading7Char" w:type="character">
+    <w:name w:val="Heading 7 Char"/>
+    <w:basedOn w:val="DefaultParagraphFont"/>
+    <w:link w:val="Heading7"/>
+    <w:uiPriority w:val="9"/>
+    <w:semiHidden/>
+    <w:rsid w:val="00A10FD9"/>
+    <w:rPr>
+      <w:rFonts w:cstheme="majorBidi" w:eastAsiaTheme="majorEastAsia"/>
+      <w:color w:themeColor="text1" w:themeTint="A6" w:val="595959"/>
+    </w:rPr>
+  </w:style>
+  <w:style w:customStyle="1" w:styleId="Heading8Char" w:type="character">
+    <w:name w:val="Heading 8 Char"/>
+    <w:basedOn w:val="DefaultParagraphFont"/>
+    <w:link w:val="Heading8"/>
+    <w:uiPriority w:val="9"/>
+    <w:semiHidden/>
+    <w:rsid w:val="00A10FD9"/>
+    <w:rPr>
+      <w:rFonts w:cstheme="majorBidi" w:eastAsiaTheme="majorEastAsia"/>
+      <w:i/>
+      <w:iCs/>
+      <w:color w:themeColor="text1" w:themeTint="D8" w:val="272727"/>
+    </w:rPr>
+  </w:style>
+  <w:style w:customStyle="1" w:styleId="Heading9Char" w:type="character">
+    <w:name w:val="Heading 9 Char"/>
+    <w:basedOn w:val="DefaultParagraphFont"/>
+    <w:link w:val="Heading9"/>
+    <w:uiPriority w:val="9"/>
+    <w:semiHidden/>
+    <w:rsid w:val="00A10FD9"/>
+    <w:rPr>
+      <w:rFonts w:cstheme="majorBidi" w:eastAsiaTheme="majorEastAsia"/>
+      <w:color w:themeColor="text1" w:themeTint="D8" w:val="272727"/>
     </w:rPr>
   </w:style>
   <w:style w:styleId="BlockText" w:type="paragraph">
@@ -733,6 +900,18 @@
     <w:uiPriority w:val="9"/>
     <w:unhideWhenUsed/>
     <w:qFormat/>
+  </w:style>
+  <w:style w:styleId="FootnoteBlockText" w:type="paragraph">
+    <w:name w:val="Footnote Block Text"/>
+    <w:basedOn w:val="FootnoteText"/>
+    <w:next w:val="FootnoteText"/>
+    <w:uiPriority w:val="9"/>
+    <w:unhideWhenUsed/>
+    <w:qFormat/>
+    <w:pPr>
+      <w:spacing w:after="100" w:before="100"/>
+      <w:ind w:firstLine="0" w:left="480" w:right="480"/>
+    </w:pPr>
   </w:style>
   <w:style w:default="1" w:styleId="DefaultParagraphFont" w:type="character">
     <w:name w:val="Default Paragraph Font"/>
@@ -762,18 +941,11 @@
       </w:tblCellMar>
     </w:tblPr>
     <w:tblStylePr w:type="firstRow">
-      <w:tblPr>
-        <w:jc w:val="left"/>
-        <w:tblInd w:type="dxa" w:w="0"/>
-      </w:tblPr>
-      <w:trPr>
-        <w:jc w:val="left"/>
-      </w:trPr>
       <w:tcPr>
-        <w:vAlign w:val="bottom"/>
         <w:tcBorders>
           <w:bottom w:val="single"/>
         </w:tcBorders>
+        <w:vAlign w:val="bottom"/>
       </w:tcPr>
     </w:tblStylePr>
   </w:style>
@@ -888,8 +1060,8 @@
     <w:name w:val="KeywordTok"/>
     <w:basedOn w:val="VerbatimChar"/>
     <w:rPr>
+      <w:b/>
       <w:color w:val="007020"/>
-      <w:b/>
     </w:rPr>
   </w:style>
   <w:style w:type="character" w:customStyle="1" w:styleId="DataTypeTok">
@@ -966,42 +1138,42 @@
     <w:name w:val="ImportTok"/>
     <w:basedOn w:val="VerbatimChar"/>
     <w:rPr>
+      <w:b/>
       <w:color w:val="008000"/>
-      <w:b/>
     </w:rPr>
   </w:style>
   <w:style w:type="character" w:customStyle="1" w:styleId="CommentTok">
     <w:name w:val="CommentTok"/>
     <w:basedOn w:val="VerbatimChar"/>
     <w:rPr>
+      <w:i/>
       <w:color w:val="60a0b0"/>
-      <w:i/>
     </w:rPr>
   </w:style>
   <w:style w:type="character" w:customStyle="1" w:styleId="DocumentationTok">
     <w:name w:val="DocumentationTok"/>
     <w:basedOn w:val="VerbatimChar"/>
     <w:rPr>
+      <w:i/>
       <w:color w:val="ba2121"/>
-      <w:i/>
     </w:rPr>
   </w:style>
   <w:style w:type="character" w:customStyle="1" w:styleId="AnnotationTok">
     <w:name w:val="AnnotationTok"/>
     <w:basedOn w:val="VerbatimChar"/>
     <w:rPr>
-      <w:color w:val="60a0b0"/>
       <w:b/>
       <w:i/>
+      <w:color w:val="60a0b0"/>
     </w:rPr>
   </w:style>
   <w:style w:type="character" w:customStyle="1" w:styleId="CommentVarTok">
     <w:name w:val="CommentVarTok"/>
     <w:basedOn w:val="VerbatimChar"/>
     <w:rPr>
-      <w:color w:val="60a0b0"/>
       <w:b/>
       <w:i/>
+      <w:color w:val="60a0b0"/>
     </w:rPr>
   </w:style>
   <w:style w:type="character" w:customStyle="1" w:styleId="OtherTok">
@@ -1029,8 +1201,8 @@
     <w:name w:val="ControlFlowTok"/>
     <w:basedOn w:val="VerbatimChar"/>
     <w:rPr>
+      <w:b/>
       <w:color w:val="007020"/>
-      <w:b/>
     </w:rPr>
   </w:style>
   <w:style w:type="character" w:customStyle="1" w:styleId="OperatorTok">
@@ -1075,34 +1247,34 @@
     <w:name w:val="InformationTok"/>
     <w:basedOn w:val="VerbatimChar"/>
     <w:rPr>
-      <w:color w:val="60a0b0"/>
       <w:b/>
       <w:i/>
+      <w:color w:val="60a0b0"/>
     </w:rPr>
   </w:style>
   <w:style w:type="character" w:customStyle="1" w:styleId="WarningTok">
     <w:name w:val="WarningTok"/>
     <w:basedOn w:val="VerbatimChar"/>
     <w:rPr>
-      <w:color w:val="60a0b0"/>
       <w:b/>
       <w:i/>
+      <w:color w:val="60a0b0"/>
     </w:rPr>
   </w:style>
   <w:style w:type="character" w:customStyle="1" w:styleId="AlertTok">
     <w:name w:val="AlertTok"/>
     <w:basedOn w:val="VerbatimChar"/>
     <w:rPr>
+      <w:b/>
       <w:color w:val="ff0000"/>
-      <w:b/>
     </w:rPr>
   </w:style>
   <w:style w:type="character" w:customStyle="1" w:styleId="ErrorTok">
     <w:name w:val="ErrorTok"/>
     <w:basedOn w:val="VerbatimChar"/>
     <w:rPr>
+      <w:b/>
       <w:color w:val="ff0000"/>
-      <w:b/>
     </w:rPr>
   </w:style>
   <w:style w:type="character" w:customStyle="1" w:styleId="NormalTok">
@@ -1124,44 +1296,44 @@
         <a:sysClr val="window" lastClr="FFFFFF"/>
       </a:lt1>
       <a:dk2>
-        <a:srgbClr val="1F497D"/>
+        <a:srgbClr val="0E2841"/>
       </a:dk2>
       <a:lt2>
-        <a:srgbClr val="EEECE1"/>
+        <a:srgbClr val="E8E8E8"/>
       </a:lt2>
       <a:accent1>
-        <a:srgbClr val="4F81BD"/>
+        <a:srgbClr val="156082"/>
       </a:accent1>
       <a:accent2>
-        <a:srgbClr val="C0504D"/>
+        <a:srgbClr val="E97132"/>
       </a:accent2>
       <a:accent3>
-        <a:srgbClr val="9BBB59"/>
+        <a:srgbClr val="196B24"/>
       </a:accent3>
       <a:accent4>
-        <a:srgbClr val="8064A2"/>
+        <a:srgbClr val="0F9ED5"/>
       </a:accent4>
       <a:accent5>
-        <a:srgbClr val="4BACC6"/>
+        <a:srgbClr val="A02B93"/>
       </a:accent5>
       <a:accent6>
-        <a:srgbClr val="F79646"/>
+        <a:srgbClr val="4EA72E"/>
       </a:accent6>
       <a:hlink>
-        <a:srgbClr val="0000FF"/>
+        <a:srgbClr val="467886"/>
       </a:hlink>
       <a:folHlink>
-        <a:srgbClr val="800080"/>
+        <a:srgbClr val="96607D"/>
       </a:folHlink>
     </a:clrScheme>
     <a:fontScheme name="Office">
       <a:majorFont>
-        <a:latin typeface="Calibri"/>
+        <a:latin typeface="Aptos Display" panose="02110004020202020204"/>
         <a:ea typeface=""/>
         <a:cs typeface=""/>
-        <a:font script="Jpan" typeface="ＭＳ ゴシック"/>
+        <a:font script="Jpan" typeface="游ゴシック Light"/>
         <a:font script="Hang" typeface="맑은 고딕"/>
-        <a:font script="Hans" typeface="宋体"/>
+        <a:font script="Hans" typeface="等线 Light"/>
         <a:font script="Hant" typeface="新細明體"/>
         <a:font script="Arab" typeface="Times New Roman"/>
         <a:font script="Hebr" typeface="Times New Roman"/>
@@ -1188,14 +1360,32 @@
         <a:font script="Mong" typeface="Mongolian Baiti"/>
         <a:font script="Viet" typeface="Times New Roman"/>
         <a:font script="Uigh" typeface="Microsoft Uighur"/>
+        <a:font script="Geor" typeface="Sylfaen"/>
+        <a:font script="Armn" typeface="Arial"/>
+        <a:font script="Bugi" typeface="Leelawadee UI"/>
+        <a:font script="Bopo" typeface="Microsoft JhengHei"/>
+        <a:font script="Java" typeface="Javanese Text"/>
+        <a:font script="Lisu" typeface="Segoe UI"/>
+        <a:font script="Mymr" typeface="Myanmar Text"/>
+        <a:font script="Nkoo" typeface="Ebrima"/>
+        <a:font script="Olck" typeface="Nirmala UI"/>
+        <a:font script="Osma" typeface="Ebrima"/>
+        <a:font script="Phag" typeface="Phagspa"/>
+        <a:font script="Syrn" typeface="Estrangelo Edessa"/>
+        <a:font script="Syrj" typeface="Estrangelo Edessa"/>
+        <a:font script="Syre" typeface="Estrangelo Edessa"/>
+        <a:font script="Sora" typeface="Nirmala UI"/>
+        <a:font script="Tale" typeface="Microsoft Tai Le"/>
+        <a:font script="Talu" typeface="Microsoft New Tai Lue"/>
+        <a:font script="Tfng" typeface="Ebrima"/>
       </a:majorFont>
       <a:minorFont>
-        <a:latin typeface="Cambria"/>
+        <a:latin typeface="Aptos" panose="02110004020202020204"/>
         <a:ea typeface=""/>
         <a:cs typeface=""/>
-        <a:font script="Jpan" typeface="ＭＳ 明朝"/>
+        <a:font script="Jpan" typeface="游明朝"/>
         <a:font script="Hang" typeface="맑은 고딕"/>
-        <a:font script="Hans" typeface="宋体"/>
+        <a:font script="Hans" typeface="等线"/>
         <a:font script="Hant" typeface="新細明體"/>
         <a:font script="Arab" typeface="Arial"/>
         <a:font script="Hebr" typeface="Arial"/>
@@ -1222,6 +1412,24 @@
         <a:font script="Mong" typeface="Mongolian Baiti"/>
         <a:font script="Viet" typeface="Arial"/>
         <a:font script="Uigh" typeface="Microsoft Uighur"/>
+        <a:font script="Geor" typeface="Sylfaen"/>
+        <a:font script="Armn" typeface="Arial"/>
+        <a:font script="Bugi" typeface="Leelawadee UI"/>
+        <a:font script="Bopo" typeface="Microsoft JhengHei"/>
+        <a:font script="Java" typeface="Javanese Text"/>
+        <a:font script="Lisu" typeface="Segoe UI"/>
+        <a:font script="Mymr" typeface="Myanmar Text"/>
+        <a:font script="Nkoo" typeface="Ebrima"/>
+        <a:font script="Olck" typeface="Nirmala UI"/>
+        <a:font script="Osma" typeface="Ebrima"/>
+        <a:font script="Phag" typeface="Phagspa"/>
+        <a:font script="Syrn" typeface="Estrangelo Edessa"/>
+        <a:font script="Syrj" typeface="Estrangelo Edessa"/>
+        <a:font script="Syre" typeface="Estrangelo Edessa"/>
+        <a:font script="Sora" typeface="Nirmala UI"/>
+        <a:font script="Tale" typeface="Microsoft Tai Le"/>
+        <a:font script="Talu" typeface="Microsoft New Tai Lue"/>
+        <a:font script="Tfng" typeface="Ebrima"/>
       </a:minorFont>
     </a:fontScheme>
     <a:fmtScheme name="Office">
@@ -1233,200 +1441,141 @@
           <a:gsLst>
             <a:gs pos="0">
               <a:schemeClr val="phClr">
-                <a:tint val="50000"/>
-                <a:satMod val="300000"/>
+                <a:lumMod val="110000"/>
+                <a:satMod val="105000"/>
+                <a:tint val="67000"/>
               </a:schemeClr>
             </a:gs>
-            <a:gs pos="35000">
+            <a:gs pos="50000">
               <a:schemeClr val="phClr">
-                <a:tint val="37000"/>
-                <a:satMod val="300000"/>
+                <a:lumMod val="105000"/>
+                <a:satMod val="103000"/>
+                <a:tint val="73000"/>
               </a:schemeClr>
             </a:gs>
             <a:gs pos="100000">
               <a:schemeClr val="phClr">
-                <a:tint val="15000"/>
-                <a:satMod val="350000"/>
+                <a:lumMod val="105000"/>
+                <a:satMod val="109000"/>
+                <a:tint val="81000"/>
               </a:schemeClr>
             </a:gs>
           </a:gsLst>
-          <a:lin ang="16200000" scaled="1"/>
+          <a:lin ang="5400000" scaled="0"/>
         </a:gradFill>
         <a:gradFill rotWithShape="1">
           <a:gsLst>
             <a:gs pos="0">
               <a:schemeClr val="phClr">
-                <a:tint val="100000"/>
+                <a:satMod val="103000"/>
+                <a:lumMod val="102000"/>
+                <a:tint val="94000"/>
+              </a:schemeClr>
+            </a:gs>
+            <a:gs pos="50000">
+              <a:schemeClr val="phClr">
+                <a:satMod val="110000"/>
+                <a:lumMod val="100000"/>
                 <a:shade val="100000"/>
-                <a:satMod val="130000"/>
               </a:schemeClr>
             </a:gs>
             <a:gs pos="100000">
               <a:schemeClr val="phClr">
-                <a:tint val="50000"/>
-                <a:shade val="100000"/>
-                <a:satMod val="350000"/>
+                <a:lumMod val="99000"/>
+                <a:satMod val="120000"/>
+                <a:shade val="78000"/>
               </a:schemeClr>
             </a:gs>
           </a:gsLst>
-          <a:lin ang="16200000" scaled="0"/>
+          <a:lin ang="5400000" scaled="0"/>
         </a:gradFill>
       </a:fillStyleLst>
       <a:lnStyleLst>
-        <a:ln w="9525" cap="flat" cmpd="sng" algn="ctr">
-          <a:solidFill>
-            <a:schemeClr val="phClr">
-              <a:shade val="95000"/>
-              <a:satMod val="105000"/>
-            </a:schemeClr>
-          </a:solidFill>
-          <a:prstDash val="solid"/>
-        </a:ln>
-        <a:ln w="25400" cap="flat" cmpd="sng" algn="ctr">
+        <a:ln w="6350" cap="flat" cmpd="sng" algn="ctr">
           <a:solidFill>
             <a:schemeClr val="phClr"/>
           </a:solidFill>
           <a:prstDash val="solid"/>
+          <a:miter lim="800000"/>
         </a:ln>
-        <a:ln w="38100" cap="flat" cmpd="sng" algn="ctr">
+        <a:ln w="12700" cap="flat" cmpd="sng" algn="ctr">
           <a:solidFill>
             <a:schemeClr val="phClr"/>
           </a:solidFill>
           <a:prstDash val="solid"/>
+          <a:miter lim="800000"/>
+        </a:ln>
+        <a:ln w="19050" cap="flat" cmpd="sng" algn="ctr">
+          <a:solidFill>
+            <a:schemeClr val="phClr"/>
+          </a:solidFill>
+          <a:prstDash val="solid"/>
+          <a:miter lim="800000"/>
         </a:ln>
       </a:lnStyleLst>
       <a:effectStyleLst>
         <a:effectStyle>
+          <a:effectLst/>
+        </a:effectStyle>
+        <a:effectStyle>
+          <a:effectLst/>
+        </a:effectStyle>
+        <a:effectStyle>
           <a:effectLst>
-            <a:outerShdw blurRad="40000" dist="20000" dir="5400000" rotWithShape="0">
+            <a:outerShdw blurRad="57150" dist="19050" dir="5400000" algn="ctr" rotWithShape="0">
               <a:srgbClr val="000000">
-                <a:alpha val="38000"/>
+                <a:alpha val="63000"/>
               </a:srgbClr>
             </a:outerShdw>
           </a:effectLst>
-        </a:effectStyle>
-        <a:effectStyle>
-          <a:effectLst>
-            <a:outerShdw blurRad="40000" dist="23000" dir="5400000" rotWithShape="0">
-              <a:srgbClr val="000000">
-                <a:alpha val="35000"/>
-              </a:srgbClr>
-            </a:outerShdw>
-          </a:effectLst>
-        </a:effectStyle>
-        <a:effectStyle>
-          <a:effectLst>
-            <a:outerShdw blurRad="40000" dist="23000" dir="5400000" rotWithShape="0">
-              <a:srgbClr val="000000">
-                <a:alpha val="35000"/>
-              </a:srgbClr>
-            </a:outerShdw>
-          </a:effectLst>
-          <a:scene3d>
-            <a:camera prst="orthographicFront">
-              <a:rot lat="0" lon="0" rev="0"/>
-            </a:camera>
-            <a:lightRig rig="threePt" dir="t">
-              <a:rot lat="0" lon="0" rev="1200000"/>
-            </a:lightRig>
-          </a:scene3d>
-          <a:sp3d>
-            <a:bevelT w="63500" h="25400"/>
-          </a:sp3d>
         </a:effectStyle>
       </a:effectStyleLst>
       <a:bgFillStyleLst>
         <a:solidFill>
           <a:schemeClr val="phClr"/>
         </a:solidFill>
+        <a:solidFill>
+          <a:schemeClr val="phClr">
+            <a:tint val="95000"/>
+            <a:satMod val="170000"/>
+          </a:schemeClr>
+        </a:solidFill>
         <a:gradFill rotWithShape="1">
           <a:gsLst>
             <a:gs pos="0">
               <a:schemeClr val="phClr">
-                <a:tint val="40000"/>
-                <a:satMod val="350000"/>
+                <a:tint val="93000"/>
+                <a:satMod val="150000"/>
+                <a:shade val="98000"/>
+                <a:lumMod val="102000"/>
               </a:schemeClr>
             </a:gs>
-            <a:gs pos="40000">
+            <a:gs pos="50000">
               <a:schemeClr val="phClr">
-                <a:tint val="45000"/>
-                <a:shade val="99000"/>
-                <a:satMod val="350000"/>
+                <a:tint val="98000"/>
+                <a:satMod val="130000"/>
+                <a:shade val="90000"/>
+                <a:lumMod val="103000"/>
               </a:schemeClr>
             </a:gs>
             <a:gs pos="100000">
               <a:schemeClr val="phClr">
-                <a:shade val="20000"/>
-                <a:satMod val="255000"/>
+                <a:shade val="63000"/>
+                <a:satMod val="120000"/>
               </a:schemeClr>
             </a:gs>
           </a:gsLst>
-          <a:path path="circle">
-            <a:fillToRect l="50000" t="-80000" r="50000" b="180000"/>
-          </a:path>
-        </a:gradFill>
-        <a:gradFill rotWithShape="1">
-          <a:gsLst>
-            <a:gs pos="0">
-              <a:schemeClr val="phClr">
-                <a:tint val="80000"/>
-                <a:satMod val="300000"/>
-              </a:schemeClr>
-            </a:gs>
-            <a:gs pos="100000">
-              <a:schemeClr val="phClr">
-                <a:shade val="30000"/>
-                <a:satMod val="200000"/>
-              </a:schemeClr>
-            </a:gs>
-          </a:gsLst>
-          <a:path path="circle">
-            <a:fillToRect l="50000" t="50000" r="50000" b="50000"/>
-          </a:path>
+          <a:lin ang="5400000" scaled="0"/>
         </a:gradFill>
       </a:bgFillStyleLst>
     </a:fmtScheme>
   </a:themeElements>
-  <a:objectDefaults>
-    <a:spDef>
-      <a:spPr/>
-      <a:bodyPr/>
-      <a:lstStyle/>
-      <a:style>
-        <a:lnRef idx="1">
-          <a:schemeClr val="accent1"/>
-        </a:lnRef>
-        <a:fillRef idx="3">
-          <a:schemeClr val="accent1"/>
-        </a:fillRef>
-        <a:effectRef idx="2">
-          <a:schemeClr val="accent1"/>
-        </a:effectRef>
-        <a:fontRef idx="minor">
-          <a:schemeClr val="lt1"/>
-        </a:fontRef>
-      </a:style>
-    </a:spDef>
-    <a:lnDef>
-      <a:spPr/>
-      <a:bodyPr/>
-      <a:lstStyle/>
-      <a:style>
-        <a:lnRef idx="2">
-          <a:schemeClr val="accent1"/>
-        </a:lnRef>
-        <a:fillRef idx="0">
-          <a:schemeClr val="accent1"/>
-        </a:fillRef>
-        <a:effectRef idx="1">
-          <a:schemeClr val="accent1"/>
-        </a:effectRef>
-        <a:fontRef idx="minor">
-          <a:schemeClr val="tx1"/>
-        </a:fontRef>
-      </a:style>
-    </a:lnDef>
-  </a:objectDefaults>
+  <a:objectDefaults/>
   <a:extraClrSchemeLst/>
+  <a:extLst>
+    <a:ext uri="{05A4C25C-085E-4340-85A3-A5531E510DB2}">
+      <thm15:themeFamily xmlns:thm15="http://schemas.microsoft.com/office/thememl/2012/main" name="Office Theme" id="{2E142A2C-CD16-42D6-873A-C26D2A0506FA}" vid="{1BDDFF52-6CD6-40A5-AB3C-68EB2F1E4D0A}"/>
+    </a:ext>
+  </a:extLst>
 </a:theme>
 </file>
</xml_diff>

<commit_message>
Correct the supplementary count in the cover letter and bring it up to date
The letter claimed four supplementary tables; there are three (S1-S3), plus
six data files and five figures. It also predated the leave-one-out layer,
never mentioned the UKB non-colocalization, and did not disclose that BBJ
TSHR support is prior-dependent -- all three are in the manuscript and
belong in the letter that introduces it. Date moved to the current revision.

Co-Authored-By: Claude Opus 5 <noreply@anthropic.com>
Claude-Session: https://claude.ai/code/session_01TiAKffYKtUstdRZFkwtJA9
</commit_message>
<xml_diff>
--- a/submission/candidate_20260911_review/COVER_LETTER_EndocrineConnections.docx
+++ b/submission/candidate_20260911_review/COVER_LETTER_EndocrineConnections.docx
@@ -19,7 +19,7 @@
         <w:widowControl/>
       </w:pPr>
       <w:r>
-        <w:t xml:space="preserve">12 September 2026</w:t>
+        <w:t xml:space="preserve">16 September 2026</w:t>
       </w:r>
     </w:p>
     <w:p>
@@ -83,25 +83,7 @@
         <w:widowControl/>
       </w:pPr>
       <w:r>
-        <w:t xml:space="preserve">Teprotumumab is effective in thyroid eye disease, but therapeutic efficacy and inherited disease susceptibility address different questions. We compared genetically proxied blood expression of TSHR and IGF1R within a screen of 2,544 druggable genes. Biobank Japan Graves disease was the discovery outcome, with UK Biobank hyperthyroidism and FinnGen Graves ophthalmopathy providing additional comparisons.</w:t>
-      </w:r>
-    </w:p>
-    <w:p>
-      <w:pPr>
-        <w:pStyle w:val="BodyText"/>
-        <w:widowControl/>
-      </w:pPr>
-      <w:r>
-        <w:t xml:space="preserve">Thirteen genes met the discovery threshold. TSHR showed associations in all outcomes and strong shared expression–disease signals in BBJ and FinnGen. IGF1R showed nominal associations in BBJ and UKB, but its shared-variant evidence remained unresolved. No additional candidate met the combined BBJ and FinnGen criterion. Cohort-frequency sensitivity analyses preserved the discovery-hit set and colocalization classifications while changing some estimates and detection thresholds.</w:t>
-      </w:r>
-    </w:p>
-    <w:p>
-      <w:pPr>
-        <w:pStyle w:val="BodyText"/>
-        <w:widowControl/>
-      </w:pPr>
-      <w:r>
-        <w:t xml:space="preserve">The manuscript presents odds ratios, confidence intervals and</w:t>
+        <w:t xml:space="preserve">Teprotumumab blocks IGF-1R and is effective in thyroid eye disease (TED). That success is sometimes read as evidence that</w:t>
       </w:r>
       <w:r>
         <w:t xml:space="preserve"> </w:t>
@@ -111,13 +93,42 @@
           <w:iCs/>
           <w:i/>
         </w:rPr>
-        <w:t xml:space="preserve">P</w:t>
-      </w:r>
-      <w:r>
-        <w:t xml:space="preserve"> </w:t>
-      </w:r>
-      <w:r>
-        <w:t xml:space="preserve">values, with supporting analyses in four supplementary tables. FinnGen uses population controls and cannot isolate eye-disease susceptibility within Graves disease. Blood expression, limited instrument counts and the colocalization model constrain inference. Orbital observations from four TED samples and one control are descriptive only. The findings do not establish treatment direction or challenge the clinical evidence for IGF-1R blockade.</w:t>
+        <w:t xml:space="preserve">IGF1R</w:t>
+      </w:r>
+      <w:r>
+        <w:t xml:space="preserve"> </w:t>
+      </w:r>
+      <w:r>
+        <w:t xml:space="preserve">also carries inherited susceptibility to Graves disease (GD). Therapeutic efficacy and disease susceptibility are different claims, and we asked whether the genetic evidence supports the second. Within a screen of 2,544 druggable genes we compared genetically proxied blood expression of</w:t>
+      </w:r>
+      <w:r>
+        <w:t xml:space="preserve"> </w:t>
+      </w:r>
+      <w:r>
+        <w:rPr>
+          <w:iCs/>
+          <w:i/>
+        </w:rPr>
+        <w:t xml:space="preserve">TSHR</w:t>
+      </w:r>
+      <w:r>
+        <w:t xml:space="preserve"> </w:t>
+      </w:r>
+      <w:r>
+        <w:t xml:space="preserve">and</w:t>
+      </w:r>
+      <w:r>
+        <w:t xml:space="preserve"> </w:t>
+      </w:r>
+      <w:r>
+        <w:rPr>
+          <w:iCs/>
+          <w:i/>
+        </w:rPr>
+        <w:t xml:space="preserve">IGF1R</w:t>
+      </w:r>
+      <w:r>
+        <w:t xml:space="preserve">, using Biobank Japan (BBJ) GD as the discovery outcome and UK Biobank (UKB) hyperthyroidism and FinnGen Graves ophthalmopathy as further comparisons.</w:t>
       </w:r>
     </w:p>
     <w:p>
@@ -126,7 +137,55 @@
         <w:widowControl/>
       </w:pPr>
       <w:r>
-        <w:t xml:space="preserve">An earlier, narrower version was considered at thyroid-focused journals. The work was subsequently restructured around the broader genetic screen. The orbital dataset is also used for a different, whole-transcriptome question in a separate manuscript under review elsewhere. Here, only three genes are described; no genome-wide expression or pathway catalogue is presented. The companion manuscript can be provided for assessment of overlap.</w:t>
+        <w:t xml:space="preserve">Thirteen genes met the discovery threshold.</w:t>
+      </w:r>
+      <w:r>
+        <w:t xml:space="preserve"> </w:t>
+      </w:r>
+      <w:r>
+        <w:rPr>
+          <w:iCs/>
+          <w:i/>
+        </w:rPr>
+        <w:t xml:space="preserve">TSHR</w:t>
+      </w:r>
+      <w:r>
+        <w:t xml:space="preserve"> </w:t>
+      </w:r>
+      <w:r>
+        <w:t xml:space="preserve">was associated with disease in all three outcomes, and the expression and disease signals colocalized in BBJ and FinnGen. They did not in UKB, even though UKB carries the strongest</w:t>
+      </w:r>
+      <w:r>
+        <w:t xml:space="preserve"> </w:t>
+      </w:r>
+      <w:r>
+        <w:rPr>
+          <w:iCs/>
+          <w:i/>
+        </w:rPr>
+        <w:t xml:space="preserve">TSHR</w:t>
+      </w:r>
+      <w:r>
+        <w:t xml:space="preserve"> </w:t>
+      </w:r>
+      <w:r>
+        <w:t xml:space="preserve">association of the three — a discordance we report rather than set aside.</w:t>
+      </w:r>
+      <w:r>
+        <w:t xml:space="preserve"> </w:t>
+      </w:r>
+      <w:r>
+        <w:rPr>
+          <w:iCs/>
+          <w:i/>
+        </w:rPr>
+        <w:t xml:space="preserve">IGF1R</w:t>
+      </w:r>
+      <w:r>
+        <w:t xml:space="preserve"> </w:t>
+      </w:r>
+      <w:r>
+        <w:t xml:space="preserve">was nominally associated in BBJ and UKB but not FinnGen, and its colocalization posterior stayed below the threshold in every outcome; in UKB it was split almost evenly between a shared variant and an expression signal that does not resolve to one. No additional candidate met the combined BBJ and FinnGen criterion.</w:t>
       </w:r>
     </w:p>
     <w:p>
@@ -135,7 +194,107 @@
         <w:widowControl/>
       </w:pPr>
       <w:r>
-        <w:t xml:space="preserve">This manuscript has not been published and is not under consideration elsewhere. The authors report no specific funding or competing interests. The orbital component received Pusan National University Hospital IRB approval 2104-018-102, with written informed consent. Author contributions and data access are disclosed. Instruments and complete primary and sensitivity results accompany the submission.</w:t>
+        <w:t xml:space="preserve">Three sensitivity analyses bound these results. Substituting eQTLGen cohort allele frequencies for reference frequencies retained all thirteen discovery hits and changed no colocalization classification. Leave-one-out analysis showed that the nominal</w:t>
+      </w:r>
+      <w:r>
+        <w:t xml:space="preserve"> </w:t>
+      </w:r>
+      <w:r>
+        <w:rPr>
+          <w:iCs/>
+          <w:i/>
+        </w:rPr>
+        <w:t xml:space="preserve">IGF1R</w:t>
+      </w:r>
+      <w:r>
+        <w:t xml:space="preserve"> </w:t>
+      </w:r>
+      <w:r>
+        <w:t xml:space="preserve">associations depend on individual instruments and that the European</w:t>
+      </w:r>
+      <w:r>
+        <w:t xml:space="preserve"> </w:t>
+      </w:r>
+      <w:r>
+        <w:rPr>
+          <w:iCs/>
+          <w:i/>
+        </w:rPr>
+        <w:t xml:space="preserve">CTLA4</w:t>
+      </w:r>
+      <w:r>
+        <w:t xml:space="preserve"> </w:t>
+      </w:r>
+      <w:r>
+        <w:t xml:space="preserve">support is concentrated in one variant. Under the most conservative shared-variant prior, colocalization support for</w:t>
+      </w:r>
+      <w:r>
+        <w:t xml:space="preserve"> </w:t>
+      </w:r>
+      <w:r>
+        <w:rPr>
+          <w:iCs/>
+          <w:i/>
+        </w:rPr>
+        <w:t xml:space="preserve">TSHR</w:t>
+      </w:r>
+      <w:r>
+        <w:t xml:space="preserve"> </w:t>
+      </w:r>
+      <w:r>
+        <w:t xml:space="preserve">falls below threshold in BBJ while holding in FinnGen; we state this in the Abstract and the Discussion rather than reporting the primary prior alone.</w:t>
+      </w:r>
+    </w:p>
+    <w:p>
+      <w:pPr>
+        <w:pStyle w:val="BodyText"/>
+        <w:widowControl/>
+      </w:pPr>
+      <w:r>
+        <w:t xml:space="preserve">We are equally explicit about what the study does not show. FinnGen compares Graves ophthalmopathy cases with population controls, so it cannot isolate eye-disease susceptibility among people who already have GD. Blood expression may not represent thymic or orbital regulation, instrument counts are small, and the colocalization model assumes a single causal variant. Orbital observations from four TED samples and one control are descriptive context, reported without significance testing. Nothing here establishes treatment direction, and weaker genetic support for</w:t>
+      </w:r>
+      <w:r>
+        <w:t xml:space="preserve"> </w:t>
+      </w:r>
+      <w:r>
+        <w:rPr>
+          <w:iCs/>
+          <w:i/>
+        </w:rPr>
+        <w:t xml:space="preserve">IGF1R</w:t>
+      </w:r>
+      <w:r>
+        <w:t xml:space="preserve"> </w:t>
+      </w:r>
+      <w:r>
+        <w:t xml:space="preserve">is not an argument against IGF-1R blockade.</w:t>
+      </w:r>
+    </w:p>
+    <w:p>
+      <w:pPr>
+        <w:pStyle w:val="BodyText"/>
+        <w:widowControl/>
+      </w:pPr>
+      <w:r>
+        <w:t xml:space="preserve">The submission includes three supplementary tables, six supplementary data files, five figures and a completed STROBE-MR checklist. Instruments and the complete primary and sensitivity results accompany the manuscript.</w:t>
+      </w:r>
+    </w:p>
+    <w:p>
+      <w:pPr>
+        <w:pStyle w:val="BodyText"/>
+        <w:widowControl/>
+      </w:pPr>
+      <w:r>
+        <w:t xml:space="preserve">An earlier, narrower version was considered at thyroid-focused journals; the work was subsequently restructured around the broader genetic screen. The orbital dataset also supports a different, whole-transcriptome question in a separate manuscript under review elsewhere. Here only three genes are described, and no genome-wide expression or pathway catalogue is presented. The companion manuscript can be provided for assessment of overlap.</w:t>
+      </w:r>
+    </w:p>
+    <w:p>
+      <w:pPr>
+        <w:pStyle w:val="BodyText"/>
+        <w:widowControl/>
+      </w:pPr>
+      <w:r>
+        <w:t xml:space="preserve">This manuscript has not been published and is not under consideration elsewhere. The authors report no specific funding and no competing interests. The orbital component received Pusan National University Hospital IRB approval 2104-018-102, with written informed consent. Author contributions and data access are disclosed in the manuscript.</w:t>
       </w:r>
     </w:p>
     <w:p>
@@ -161,7 +320,7 @@
         <w:br/>
       </w:r>
       <w:r>
-        <w:t xml:space="preserve">Corresponding author, on behalf of Jungyul Park, Min-Seon Kim, Kyung-Hwa Shin and Suk-Woo Yang</w:t>
+        <w:t xml:space="preserve">Corresponding author, with Kyung-Hwa Shin, MD, as co-corresponding author, on behalf of Jungyul Park, Min-Seon Kim, Kyung-Hwa Shin and Suk-Woo Yang</w:t>
       </w:r>
       <w:r>
         <w:br/>

</xml_diff>